<commit_message>
dashboard/ 	docs/ 	inputs/ 	model/ 	results/ run_archive/ 	saved_plots/
</commit_message>
<xml_diff>
--- a/docs/plan.docx
+++ b/docs/plan.docx
@@ -10,18 +10,6 @@
     <w:p>
       <w:r>
         <w:t>Git:</w:t>
-      </w:r>
-    </w:p>
-    <w:p>
-      <w:pPr>
-        <w:pStyle w:val="ListParagraph"/>
-        <w:numPr>
-          <w:ilvl w:val="0"/>
-          <w:numId w:val="1"/>
-        </w:numPr>
-      </w:pPr>
-      <w:r>
-        <w:t>Clean up git files</w:t>
       </w:r>
     </w:p>
     <w:p>

</xml_diff>